<commit_message>
German series: male protagonist (Felix Hartmann, younger son)
Co-Authored-By: Claude Opus 5.5 <noreply@anthropic.com>
Claude-Session: https://claude.ai/code/session_014Pwa4fJotSRvNewqVrvk7U
</commit_message>
<xml_diff>
--- a/business_de/part1/ep01_Die_Uebergabe.docx
+++ b/business_de/part1/ep01_Die_Uebergabe.docx
@@ -180,7 +180,7 @@
                 <w:b w:val="0"/>
                 <w:sz w:val="19"/>
               </w:rPr>
-              <w:t>Clara Hartmann (후계자, 33) · Heinrich Hartmann (회장, 75) · Matthias Hartmann (국내영업 책임자, 오빠, 40) · Bernd Kowalski (연마 마이스터, 61) · Dieter Brandt (재무 책임자) · Uwe Krämer (노사협의회 의장) · Leon Neumann (견습생, 19)</w:t>
+              <w:t>Felix Hartmann (후계자, 33) · Heinrich Hartmann (회장, 75) · Matthias Hartmann (국내영업 책임자, 형, 40) · Bernd Kowalski (연마 마이스터, 61) · Dieter Brandt (재무 책임자) · Uwe Krämer (노사협의회 의장) · Leon Neumann (견습생, 19)</w:t>
             </w:r>
           </w:p>
         </w:tc>
@@ -303,7 +303,7 @@
                 <w:b w:val="0"/>
                 <w:sz w:val="19"/>
               </w:rPr>
-              <w:t>대화 120턴 (Clara 42 · Heinrich 22 · Bernd 15 · Matthias 15 · Uwe 10 · Dieter 9 · Leon 7) · A2 15% / B1 35% / B2 35% / C1 15% 목표</w:t>
+              <w:t>대화 120턴 (Felix 42 · Heinrich 22 · Bernd 15 · Matthias 15 · Uwe 10 · Dieter 9 · Leon 7) · A2 15% / B1 35% / B2 35% / C1 15% 목표</w:t>
             </w:r>
           </w:p>
         </w:tc>
@@ -720,7 +720,7 @@
           <w:color w:val="666666"/>
           <w:sz w:val="19"/>
         </w:rPr>
-        <w:t>Freitag, 13. März, 16:45 Uhr. Solingen-Wald, Werkshalle 2 der Klingenwerk Hartmann GmbH. Zwischen den Schleifmaschinen stehen Stehtische, ein Bierwagen und ein Banner: „75 Jahre Heinrich Hartmann – 50 Jahre im Werk“. Clara Hartmann, 33, kommt direkt vom ICE aus München, den Rollkoffer noch in der Hand.</w:t>
+        <w:t>Freitag, 13. März, 16:45 Uhr. Solingen-Wald, Werkshalle 2 der Klingenwerk Hartmann GmbH. Zwischen den Schleifmaschinen stehen Stehtische, ein Bierwagen und ein Banner: „75 Jahre Heinrich Hartmann – 50 Jahre im Werk“. Felix Hartmann, 33, kommt direkt vom ICE aus München, den Rollkoffer noch in der Hand.</w:t>
       </w:r>
     </w:p>
     <w:p>
@@ -779,7 +779,7 @@
           <w:color w:val="1F5A8C"/>
           <w:sz w:val="21"/>
         </w:rPr>
-        <w:t>Clara:</w:t>
+        <w:t>Felix:</w:t>
       </w:r>
       <w:r>
         <w:rPr>
@@ -813,7 +813,7 @@
           <w:sz w:val="22"/>
         </w:rPr>
         <w:tab/>
-        <w:t>Oh... Dann sind Sie bestimmt Frau Hartmann. Die Tochter vom Chef.</w:t>
+        <w:t>Oh... Dann sind Sie bestimmt Herr Hartmann. Der Sohn vom Chef.</w:t>
       </w:r>
     </w:p>
     <w:p>
@@ -831,7 +831,7 @@
           <w:color w:val="1F5A8C"/>
           <w:sz w:val="21"/>
         </w:rPr>
-        <w:t>Clara:</w:t>
+        <w:t>Felix:</w:t>
       </w:r>
       <w:r>
         <w:rPr>
@@ -839,7 +839,7 @@
           <w:sz w:val="22"/>
         </w:rPr>
         <w:tab/>
-        <w:t>Clara reicht. Und du bist...?</w:t>
+        <w:t>Felix reicht. Und du bist...?</w:t>
       </w:r>
     </w:p>
     <w:p>
@@ -883,7 +883,7 @@
           <w:color w:val="1F5A8C"/>
           <w:sz w:val="21"/>
         </w:rPr>
-        <w:t>Clara:</w:t>
+        <w:t>Felix:</w:t>
       </w:r>
       <w:r>
         <w:rPr>
@@ -958,7 +958,7 @@
           <w:sz w:val="22"/>
         </w:rPr>
         <w:tab/>
-        <w:t>Na, sieh mal einer an. Die Clara. Aus München eingeflogen.</w:t>
+        <w:t>Na, sieh mal einer an. Der Felix. Aus München eingeflogen.</w:t>
       </w:r>
     </w:p>
     <w:p>
@@ -976,7 +976,7 @@
           <w:color w:val="1F5A8C"/>
           <w:sz w:val="21"/>
         </w:rPr>
-        <w:t>Clara:</w:t>
+        <w:t>Felix:</w:t>
       </w:r>
       <w:r>
         <w:rPr>
@@ -1028,7 +1028,7 @@
           <w:color w:val="1F5A8C"/>
           <w:sz w:val="21"/>
         </w:rPr>
-        <w:t>Clara:</w:t>
+        <w:t>Felix:</w:t>
       </w:r>
       <w:r>
         <w:rPr>
@@ -1088,7 +1088,7 @@
           <w:sz w:val="22"/>
         </w:rPr>
         <w:tab/>
-        <w:t>(kommt mit einem Tablett Gläser) Frau Hartmann, willkommen zu Hause. Ihr Vater wird sich freuen.</w:t>
+        <w:t>(kommt mit einem Tablett Gläser) Herr Hartmann, willkommen zu Hause. Ihr Vater wird sich freuen.</w:t>
       </w:r>
     </w:p>
     <w:p>
@@ -1106,7 +1106,7 @@
           <w:color w:val="1F5A8C"/>
           <w:sz w:val="21"/>
         </w:rPr>
-        <w:t>Clara:</w:t>
+        <w:t>Felix:</w:t>
       </w:r>
       <w:r>
         <w:rPr>
@@ -1158,7 +1158,7 @@
           <w:color w:val="1F5A8C"/>
           <w:sz w:val="21"/>
         </w:rPr>
-        <w:t>Clara:</w:t>
+        <w:t>Felix:</w:t>
       </w:r>
       <w:r>
         <w:rPr>
@@ -1270,7 +1270,7 @@
           <w:sz w:val="22"/>
         </w:rPr>
         <w:tab/>
-        <w:t>(leise zu Clara) Du weißt es, oder? Du bist nicht nur zum Kuchenessen gekommen.</w:t>
+        <w:t>(leise zu Felix) Du weißt es, oder? Du bist nicht nur zum Kuchenessen gekommen.</w:t>
       </w:r>
     </w:p>
     <w:p>
@@ -1288,7 +1288,7 @@
           <w:color w:val="1F5A8C"/>
           <w:sz w:val="21"/>
         </w:rPr>
-        <w:t>Clara:</w:t>
+        <w:t>Felix:</w:t>
       </w:r>
       <w:r>
         <w:rPr>
@@ -1482,7 +1482,7 @@
           <w:sz w:val="22"/>
         </w:rPr>
         <w:tab/>
-        <w:t>(leise zu Clara) Jetzt kommt's.</w:t>
+        <w:t>(leise zu Felix) Jetzt kommt's.</w:t>
       </w:r>
     </w:p>
     <w:p>
@@ -1612,7 +1612,7 @@
           <w:sz w:val="22"/>
         </w:rPr>
         <w:tab/>
-        <w:t>Meine Tochter Clara. Sie hat zehn Jahre in der Unternehmensberatung gearbeitet. Sie kennt Zahlen, Märkte und Menschen. Und sie hatte hier schon vier Pflaster an den Fingern.</w:t>
+        <w:t>Mein Sohn Felix. Er hat zehn Jahre in der Unternehmensberatung gearbeitet. Er kennt Zahlen, Märkte und Menschen. Und er hatte hier schon vier Pflaster an den Fingern.</w:t>
       </w:r>
     </w:p>
     <w:p>
@@ -1679,7 +1679,7 @@
           <w:sz w:val="22"/>
         </w:rPr>
         <w:tab/>
-        <w:t>Clara, möchtest du ein paar Worte sagen?</w:t>
+        <w:t>Felix, möchtest du ein paar Worte sagen?</w:t>
       </w:r>
     </w:p>
     <w:p>
@@ -1697,7 +1697,7 @@
           <w:color w:val="1F5A8C"/>
           <w:sz w:val="21"/>
         </w:rPr>
-        <w:t>Clara:</w:t>
+        <w:t>Felix:</w:t>
       </w:r>
       <w:r>
         <w:rPr>
@@ -1749,7 +1749,7 @@
           <w:color w:val="1F5A8C"/>
           <w:sz w:val="21"/>
         </w:rPr>
-        <w:t>Clara:</w:t>
+        <w:t>Felix:</w:t>
       </w:r>
       <w:r>
         <w:rPr>
@@ -1801,7 +1801,7 @@
           <w:color w:val="1F5A8C"/>
           <w:sz w:val="21"/>
         </w:rPr>
-        <w:t>Clara:</w:t>
+        <w:t>Felix:</w:t>
       </w:r>
       <w:r>
         <w:rPr>
@@ -1891,7 +1891,7 @@
           <w:sz w:val="22"/>
         </w:rPr>
         <w:tab/>
-        <w:t>Glückwunsch, Frau Geschäftsführerin.</w:t>
+        <w:t>Glückwunsch, Herr Geschäftsführer.</w:t>
       </w:r>
     </w:p>
     <w:p>
@@ -1909,7 +1909,7 @@
           <w:color w:val="1F5A8C"/>
           <w:sz w:val="21"/>
         </w:rPr>
-        <w:t>Clara:</w:t>
+        <w:t>Felix:</w:t>
       </w:r>
       <w:r>
         <w:rPr>
@@ -1961,7 +1961,7 @@
           <w:color w:val="1F5A8C"/>
           <w:sz w:val="21"/>
         </w:rPr>
-        <w:t>Clara:</w:t>
+        <w:t>Felix:</w:t>
       </w:r>
       <w:r>
         <w:rPr>
@@ -2013,7 +2013,7 @@
           <w:color w:val="1F5A8C"/>
           <w:sz w:val="21"/>
         </w:rPr>
-        <w:t>Clara:</w:t>
+        <w:t>Felix:</w:t>
       </w:r>
       <w:r>
         <w:rPr>
@@ -2091,7 +2091,7 @@
           <w:color w:val="1F5A8C"/>
           <w:sz w:val="21"/>
         </w:rPr>
-        <w:t>Clara:</w:t>
+        <w:t>Felix:</w:t>
       </w:r>
       <w:r>
         <w:rPr>
@@ -2169,7 +2169,7 @@
           <w:color w:val="1F5A8C"/>
           <w:sz w:val="21"/>
         </w:rPr>
-        <w:t>Clara:</w:t>
+        <w:t>Felix:</w:t>
       </w:r>
       <w:r>
         <w:rPr>
@@ -2221,7 +2221,7 @@
           <w:color w:val="1F5A8C"/>
           <w:sz w:val="21"/>
         </w:rPr>
-        <w:t>Clara:</w:t>
+        <w:t>Felix:</w:t>
       </w:r>
       <w:r>
         <w:rPr>
@@ -2273,7 +2273,7 @@
           <w:color w:val="1F5A8C"/>
           <w:sz w:val="21"/>
         </w:rPr>
-        <w:t>Clara:</w:t>
+        <w:t>Felix:</w:t>
       </w:r>
       <w:r>
         <w:rPr>
@@ -2325,7 +2325,7 @@
           <w:color w:val="1F5A8C"/>
           <w:sz w:val="21"/>
         </w:rPr>
-        <w:t>Clara:</w:t>
+        <w:t>Felix:</w:t>
       </w:r>
       <w:r>
         <w:rPr>
@@ -2359,7 +2359,7 @@
           <w:sz w:val="22"/>
         </w:rPr>
         <w:tab/>
-        <w:t>Darf ich Ihnen einen Rat geben, Frau Hartmann?</w:t>
+        <w:t>Darf ich Ihnen einen Rat geben, Herr Hartmann?</w:t>
       </w:r>
     </w:p>
     <w:p>
@@ -2377,7 +2377,7 @@
           <w:color w:val="1F5A8C"/>
           <w:sz w:val="21"/>
         </w:rPr>
-        <w:t>Clara:</w:t>
+        <w:t>Felix:</w:t>
       </w:r>
       <w:r>
         <w:rPr>
@@ -2455,7 +2455,7 @@
           <w:color w:val="1F5A8C"/>
           <w:sz w:val="21"/>
         </w:rPr>
-        <w:t>Clara:</w:t>
+        <w:t>Felix:</w:t>
       </w:r>
       <w:r>
         <w:rPr>
@@ -2623,7 +2623,7 @@
           <w:sz w:val="22"/>
         </w:rPr>
         <w:tab/>
-        <w:t>Aber vielleicht will sie ja wachsen und nicht sparen?</w:t>
+        <w:t>Aber vielleicht will er ja wachsen und nicht sparen?</w:t>
       </w:r>
     </w:p>
     <w:p>
@@ -2719,7 +2719,7 @@
           <w:color w:val="1F5A8C"/>
           <w:sz w:val="21"/>
         </w:rPr>
-        <w:t>Clara:</w:t>
+        <w:t>Felix:</w:t>
       </w:r>
       <w:r>
         <w:rPr>
@@ -2768,7 +2768,7 @@
           <w:sz w:val="22"/>
         </w:rPr>
         <w:tab/>
-        <w:t>Frau Hartmann. Wir haben gerade...</w:t>
+        <w:t>Herr Hartmann. Wir haben gerade...</w:t>
       </w:r>
     </w:p>
     <w:p>
@@ -2786,7 +2786,7 @@
           <w:color w:val="1F5A8C"/>
           <w:sz w:val="21"/>
         </w:rPr>
-        <w:t>Clara:</w:t>
+        <w:t>Felix:</w:t>
       </w:r>
       <w:r>
         <w:rPr>
@@ -2838,7 +2838,7 @@
           <w:color w:val="1F5A8C"/>
           <w:sz w:val="21"/>
         </w:rPr>
-        <w:t>Clara:</w:t>
+        <w:t>Felix:</w:t>
       </w:r>
       <w:r>
         <w:rPr>
@@ -2890,7 +2890,7 @@
           <w:color w:val="1F5A8C"/>
           <w:sz w:val="21"/>
         </w:rPr>
-        <w:t>Clara:</w:t>
+        <w:t>Felix:</w:t>
       </w:r>
       <w:r>
         <w:rPr>
@@ -2968,7 +2968,7 @@
           <w:color w:val="1F5A8C"/>
           <w:sz w:val="21"/>
         </w:rPr>
-        <w:t>Clara:</w:t>
+        <w:t>Felix:</w:t>
       </w:r>
       <w:r>
         <w:rPr>
@@ -3046,7 +3046,7 @@
           <w:color w:val="1F5A8C"/>
           <w:sz w:val="21"/>
         </w:rPr>
-        <w:t>Clara:</w:t>
+        <w:t>Felix:</w:t>
       </w:r>
       <w:r>
         <w:rPr>
@@ -3098,7 +3098,7 @@
           <w:color w:val="1F5A8C"/>
           <w:sz w:val="21"/>
         </w:rPr>
-        <w:t>Clara:</w:t>
+        <w:t>Felix:</w:t>
       </w:r>
       <w:r>
         <w:rPr>
@@ -3132,7 +3132,7 @@
           <w:sz w:val="22"/>
         </w:rPr>
         <w:tab/>
-        <w:t>Eine Frage noch. Jetzt, wo du Chefin wirst: Muss ich dich ab Juli siezen?</w:t>
+        <w:t>Eine Frage noch. Jetzt, wo du Chef wirst: Muss ich dich ab Juli siezen?</w:t>
       </w:r>
     </w:p>
     <w:p>
@@ -3150,7 +3150,7 @@
           <w:color w:val="1F5A8C"/>
           <w:sz w:val="21"/>
         </w:rPr>
-        <w:t>Clara:</w:t>
+        <w:t>Felix:</w:t>
       </w:r>
       <w:r>
         <w:rPr>
@@ -3240,7 +3240,7 @@
           <w:sz w:val="22"/>
         </w:rPr>
         <w:tab/>
-        <w:t>Na? Wie war dein erster Abend als Chefin?</w:t>
+        <w:t>Na? Wie war dein erster Abend als Chef?</w:t>
       </w:r>
     </w:p>
     <w:p>
@@ -3258,7 +3258,7 @@
           <w:color w:val="1F5A8C"/>
           <w:sz w:val="21"/>
         </w:rPr>
-        <w:t>Clara:</w:t>
+        <w:t>Felix:</w:t>
       </w:r>
       <w:r>
         <w:rPr>
@@ -3266,7 +3266,7 @@
           <w:sz w:val="22"/>
         </w:rPr>
         <w:tab/>
-        <w:t>Ich bin noch nicht Chefin, Papa. Erst ab Juli.</w:t>
+        <w:t>Ich bin noch nicht Chef, Papa. Erst ab Juli.</w:t>
       </w:r>
     </w:p>
     <w:p>
@@ -3310,7 +3310,7 @@
           <w:color w:val="1F5A8C"/>
           <w:sz w:val="21"/>
         </w:rPr>
-        <w:t>Clara:</w:t>
+        <w:t>Felix:</w:t>
       </w:r>
       <w:r>
         <w:rPr>
@@ -3362,7 +3362,7 @@
           <w:color w:val="1F5A8C"/>
           <w:sz w:val="21"/>
         </w:rPr>
-        <w:t>Clara:</w:t>
+        <w:t>Felix:</w:t>
       </w:r>
       <w:r>
         <w:rPr>
@@ -3414,7 +3414,7 @@
           <w:color w:val="1F5A8C"/>
           <w:sz w:val="21"/>
         </w:rPr>
-        <w:t>Clara:</w:t>
+        <w:t>Felix:</w:t>
       </w:r>
       <w:r>
         <w:rPr>
@@ -3466,7 +3466,7 @@
           <w:color w:val="1F5A8C"/>
           <w:sz w:val="21"/>
         </w:rPr>
-        <w:t>Clara:</w:t>
+        <w:t>Felix:</w:t>
       </w:r>
       <w:r>
         <w:rPr>
@@ -3518,7 +3518,7 @@
           <w:color w:val="1F5A8C"/>
           <w:sz w:val="21"/>
         </w:rPr>
-        <w:t>Clara:</w:t>
+        <w:t>Felix:</w:t>
       </w:r>
       <w:r>
         <w:rPr>
@@ -3570,7 +3570,7 @@
           <w:color w:val="1F5A8C"/>
           <w:sz w:val="21"/>
         </w:rPr>
-        <w:t>Clara:</w:t>
+        <w:t>Felix:</w:t>
       </w:r>
       <w:r>
         <w:rPr>
@@ -3622,7 +3622,7 @@
           <w:color w:val="1F5A8C"/>
           <w:sz w:val="21"/>
         </w:rPr>
-        <w:t>Clara:</w:t>
+        <w:t>Felix:</w:t>
       </w:r>
       <w:r>
         <w:rPr>
@@ -3674,7 +3674,7 @@
           <w:color w:val="1F5A8C"/>
           <w:sz w:val="21"/>
         </w:rPr>
-        <w:t>Clara:</w:t>
+        <w:t>Felix:</w:t>
       </w:r>
       <w:r>
         <w:rPr>
@@ -3741,7 +3741,7 @@
           <w:color w:val="1F5A8C"/>
           <w:sz w:val="21"/>
         </w:rPr>
-        <w:t>Clara:</w:t>
+        <w:t>Felix:</w:t>
       </w:r>
       <w:r>
         <w:rPr>
@@ -3793,7 +3793,7 @@
           <w:color w:val="1F5A8C"/>
           <w:sz w:val="21"/>
         </w:rPr>
-        <w:t>Clara:</w:t>
+        <w:t>Felix:</w:t>
       </w:r>
       <w:r>
         <w:rPr>
@@ -3938,7 +3938,7 @@
           <w:color w:val="1F5A8C"/>
           <w:sz w:val="21"/>
         </w:rPr>
-        <w:t>Clara:</w:t>
+        <w:t>Felix:</w:t>
       </w:r>
       <w:r>
         <w:rPr>
@@ -3990,7 +3990,7 @@
           <w:color w:val="1F5A8C"/>
           <w:sz w:val="21"/>
         </w:rPr>
-        <w:t>Clara:</w:t>
+        <w:t>Felix:</w:t>
       </w:r>
       <w:r>
         <w:rPr>
@@ -4120,9 +4120,9 @@
           <w:rFonts w:ascii="Calibri" w:hAnsi="Calibri" w:eastAsia="Malgun Gothic"/>
           <w:sz w:val="20"/>
         </w:rPr>
-        <w:t>Heinrich Hartmann übergibt die Geschäftsführung zum 01.07. an Clara Hartmann. Er bleibt Gesellschafter und wechselt in den Beirat.</w:t>
+        <w:t>Heinrich Hartmann übergibt die Geschäftsführung zum 01.07. an Felix Hartmann. Er bleibt Gesellschafter und wechselt in den Beirat.</w:t>
         <w:br/>
-        <w:t>→ 하인리히 하르트만은 7월 1일부로 경영권을 클라라 하르트만에게 넘긴다. 지분은 유지하고 자문위원회로 옮긴다.</w:t>
+        <w:t>→ 하인리히 하르트만은 7월 1일부로 경영권을 펠릭스 하르트만에게 넘긴다. 지분은 유지하고 자문위원회로 옮긴다.</w:t>
       </w:r>
     </w:p>
     <w:p>
@@ -4158,9 +4158,9 @@
           <w:rFonts w:ascii="Calibri" w:hAnsi="Calibri" w:eastAsia="Malgun Gothic"/>
           <w:sz w:val="20"/>
         </w:rPr>
-        <w:t>Bestandsaufnahme aller Abteilungen, Maschinen und Gespräche. Verantwortlich: C. Hartmann.</w:t>
+        <w:t>Bestandsaufnahme aller Abteilungen, Maschinen und Gespräche. Verantwortlich: F. Hartmann.</w:t>
         <w:br/>
-        <w:t>→ 모든 부서·기계·면담에 대한 현황 점검. 책임자: C. 하르트만.</w:t>
+        <w:t>→ 모든 부서·기계·면담에 대한 현황 점검. 책임자: F. 하르트만.</w:t>
       </w:r>
     </w:p>
     <w:p>
@@ -7873,7 +7873,7 @@
           <w:rFonts w:ascii="Calibri" w:hAnsi="Calibri" w:eastAsia="Malgun Gothic"/>
           <w:sz w:val="20"/>
         </w:rPr>
-        <w:t>„Jetzt, wo du Chefin wirst: Muss ich dich siezen?“ wo가 '~하게 된 지금'의 뜻으로 쓰이는 구어 구문. 문어에서는 „Da du jetzt Chefin wirst…“.</w:t>
+        <w:t>„Jetzt, wo du Chef wirst: Muss ich dich siezen?“ wo가 '~하게 된 지금'의 뜻으로 쓰이는 구어 구문. 문어에서는 „Da du jetzt Chef wirst…“.</w:t>
       </w:r>
     </w:p>
     <w:p>
@@ -7907,7 +7907,7 @@
           <w:color w:val="666666"/>
           <w:sz w:val="18"/>
         </w:rPr>
-        <w:t>이 화의 결말을 이어, 클라라가 서울의 최 바이어에게 보낼 첫 이메일입니다.</w:t>
+        <w:t>이 화의 결말을 이어, 펠릭스가 서울의 최 바이어에게 보낼 첫 이메일입니다.</w:t>
       </w:r>
     </w:p>
     <w:p>
@@ -7955,7 +7955,7 @@
           <w:rFonts w:ascii="Calibri" w:hAnsi="Calibri" w:eastAsia="Malgun Gothic"/>
           <w:sz w:val="20"/>
         </w:rPr>
-        <w:t>Mein Name ist Clara Hartmann. Zum 1. Juli übernehme ich die Geschäftsführung unseres Familienunternehmens. Der Ausbau unseres Exportgeschäfts, insbesondere in Asien, wird einer meiner Schwerpunkte sein.</w:t>
+        <w:t>Mein Name ist Felix Hartmann. Zum 1. Juli übernehme ich die Geschäftsführung unseres Familienunternehmens. Der Ausbau unseres Exportgeschäfts, insbesondere in Asien, wird einer meiner Schwerpunkte sein.</w:t>
       </w:r>
     </w:p>
     <w:p>
@@ -7993,7 +7993,7 @@
         </w:rPr>
         <w:t>Mit freundlichen Grüßen</w:t>
         <w:br/>
-        <w:t>Clara Hartmann</w:t>
+        <w:t>Felix Hartmann</w:t>
         <w:br/>
         <w:t>Klingenwerk Hartmann GmbH · Solingen</w:t>
       </w:r>
@@ -8007,7 +8007,7 @@
           <w:rFonts w:ascii="Calibri" w:hAnsi="Calibri" w:eastAsia="Malgun Gothic"/>
           <w:sz w:val="20"/>
         </w:rPr>
-        <w:t>[한국어 번역] 제목: 암비엔테 박람회 저희 부스 방문 건 / 최 선생님께, 프랑크푸르트 암비엔테에서 저희 식칼에 관심을 보여 주셔서 감사합니다. 답변이 크게 늦어진 점 진심으로 사과드립니다. 저는 클라라 하르트만이며 7월 1일부로 저희 가족기업의 경영을 맡습니다. 특히 아시아를 중심으로 수출 사업을 확대하는 것이 제 중점 과제 중 하나가 될 것입니다. 며칠 안에 최신 카탈로그와 가격표를 보내 드리겠습니다. 또한 귀사가 여전히 협력에 관심이 있으신지 여쭤봐도 될까요? 회신 기다리겠습니다. 감사합니다. 클라라 하르트만 드림.</w:t>
+        <w:t>[한국어 번역] 제목: 암비엔테 박람회 저희 부스 방문 건 / 최 선생님께, 프랑크푸르트 암비엔테에서 저희 식칼에 관심을 보여 주셔서 감사합니다. 답변이 크게 늦어진 점 진심으로 사과드립니다. 저는 펠릭스 하르트만이며 7월 1일부로 저희 가족기업의 경영을 맡습니다. 특히 아시아를 중심으로 수출 사업을 확대하는 것이 제 중점 과제 중 하나가 될 것입니다. 며칠 안에 최신 카탈로그와 가격표를 보내 드리겠습니다. 또한 귀사가 여전히 협력에 관심이 있으신지 여쭤봐도 될까요? 회신 기다리겠습니다. 감사합니다. 펠릭스 하르트만 드림.</w:t>
       </w:r>
     </w:p>
     <w:p>
@@ -8200,7 +8200,7 @@
           <w:color w:val="666666"/>
           <w:sz w:val="19"/>
         </w:rPr>
-        <w:t>3월 13일 금요일 오후 4시 45분. 졸링겐-발트, 클링겐베르크 하르트만 유한회사의 제2작업동. 연마기 사이에 스탠딩 테이블과 맥주 수레, 그리고 현수막이 서 있다. '하인리히 하르트만 75세 – 근속 50년'. 서른세 살의 클라라 하르트만이 뮌헨에서 ICE를 타고 곧장 도착한다. 손에는 아직 여행 가방이 들려 있다.</w:t>
+        <w:t>3월 13일 금요일 오후 4시 45분. 졸링겐-발트, 클링겐베르크 하르트만 유한회사의 제2작업동. 연마기 사이에 스탠딩 테이블과 맥주 수레, 그리고 현수막이 서 있다. '하인리히 하르트만 75세 – 근속 50년'. 서른세 살의 펠릭스 하르트만이 뮌헨에서 ICE를 타고 곧장 도착한다. 손에는 아직 여행 가방이 들려 있다.</w:t>
       </w:r>
     </w:p>
     <w:p>
@@ -8260,7 +8260,7 @@
           <w:color w:val="1F5A8C"/>
           <w:sz w:val="21"/>
         </w:rPr>
-        <w:t>Clara:</w:t>
+        <w:t>Felix:</w:t>
       </w:r>
       <w:r>
         <w:rPr>
@@ -8294,7 +8294,7 @@
           <w:sz w:val="21"/>
         </w:rPr>
         <w:tab/>
-        <w:t>아... 그럼 하르트만 씨시군요. 사장님 따님.</w:t>
+        <w:t>아... 그럼 하르트만 씨시군요. 사장님 아드님.</w:t>
       </w:r>
     </w:p>
     <w:p>
@@ -8312,7 +8312,7 @@
           <w:color w:val="1F5A8C"/>
           <w:sz w:val="21"/>
         </w:rPr>
-        <w:t>Clara:</w:t>
+        <w:t>Felix:</w:t>
       </w:r>
       <w:r>
         <w:rPr>
@@ -8320,7 +8320,7 @@
           <w:sz w:val="21"/>
         </w:rPr>
         <w:tab/>
-        <w:t>클라라면 돼요. 그리고 넌...?</w:t>
+        <w:t>펠릭스면 돼요. 그리고 넌...?</w:t>
       </w:r>
     </w:p>
     <w:p>
@@ -8364,7 +8364,7 @@
           <w:color w:val="1F5A8C"/>
           <w:sz w:val="21"/>
         </w:rPr>
-        <w:t>Clara:</w:t>
+        <w:t>Felix:</w:t>
       </w:r>
       <w:r>
         <w:rPr>
@@ -8439,7 +8439,7 @@
           <w:sz w:val="21"/>
         </w:rPr>
         <w:tab/>
-        <w:t>이게 누구야. 클라라잖아. 뮌헨에서 날아왔구먼.</w:t>
+        <w:t>이게 누구야. 펠릭스잖아. 뮌헨에서 날아왔구먼.</w:t>
       </w:r>
     </w:p>
     <w:p>
@@ -8457,7 +8457,7 @@
           <w:color w:val="1F5A8C"/>
           <w:sz w:val="21"/>
         </w:rPr>
-        <w:t>Clara:</w:t>
+        <w:t>Felix:</w:t>
       </w:r>
       <w:r>
         <w:rPr>
@@ -8509,7 +8509,7 @@
           <w:color w:val="1F5A8C"/>
           <w:sz w:val="21"/>
         </w:rPr>
-        <w:t>Clara:</w:t>
+        <w:t>Felix:</w:t>
       </w:r>
       <w:r>
         <w:rPr>
@@ -8587,7 +8587,7 @@
           <w:color w:val="1F5A8C"/>
           <w:sz w:val="21"/>
         </w:rPr>
-        <w:t>Clara:</w:t>
+        <w:t>Felix:</w:t>
       </w:r>
       <w:r>
         <w:rPr>
@@ -8639,7 +8639,7 @@
           <w:color w:val="1F5A8C"/>
           <w:sz w:val="21"/>
         </w:rPr>
-        <w:t>Clara:</w:t>
+        <w:t>Felix:</w:t>
       </w:r>
       <w:r>
         <w:rPr>
@@ -8751,7 +8751,7 @@
           <w:sz w:val="21"/>
         </w:rPr>
         <w:tab/>
-        <w:t>(클라라에게 조용히) 넌 알지? 케이크 먹으러만 온 건 아니잖아.</w:t>
+        <w:t>(펠릭스에게 조용히) 넌 알지? 케이크 먹으러만 온 건 아니잖아.</w:t>
       </w:r>
     </w:p>
     <w:p>
@@ -8769,7 +8769,7 @@
           <w:color w:val="1F5A8C"/>
           <w:sz w:val="21"/>
         </w:rPr>
-        <w:t>Clara:</w:t>
+        <w:t>Felix:</w:t>
       </w:r>
       <w:r>
         <w:rPr>
@@ -8964,7 +8964,7 @@
           <w:sz w:val="21"/>
         </w:rPr>
         <w:tab/>
-        <w:t>(클라라에게 조용히) 이제 나온다.</w:t>
+        <w:t>(펠릭스에게 조용히) 이제 나온다.</w:t>
       </w:r>
     </w:p>
     <w:p>
@@ -9094,7 +9094,7 @@
           <w:sz w:val="21"/>
         </w:rPr>
         <w:tab/>
-        <w:t>제 딸 클라라입니다. 10년간 경영 컨설팅에서 일했습니다. 숫자와 시장과 사람을 압니다. 그리고 이미 여기서 손가락에 반창고를 네 개나 붙였었죠.</w:t>
+        <w:t>제 아들 펠릭스입니다. 10년간 경영 컨설팅에서 일했습니다. 숫자와 시장과 사람을 압니다. 그리고 이미 여기서 손가락에 반창고를 네 개나 붙였었죠.</w:t>
       </w:r>
     </w:p>
     <w:p>
@@ -9161,7 +9161,7 @@
           <w:sz w:val="21"/>
         </w:rPr>
         <w:tab/>
-        <w:t>클라라, 몇 마디 하겠니?</w:t>
+        <w:t>펠릭스, 몇 마디 하겠니?</w:t>
       </w:r>
     </w:p>
     <w:p>
@@ -9179,7 +9179,7 @@
           <w:color w:val="1F5A8C"/>
           <w:sz w:val="21"/>
         </w:rPr>
-        <w:t>Clara:</w:t>
+        <w:t>Felix:</w:t>
       </w:r>
       <w:r>
         <w:rPr>
@@ -9231,7 +9231,7 @@
           <w:color w:val="1F5A8C"/>
           <w:sz w:val="21"/>
         </w:rPr>
-        <w:t>Clara:</w:t>
+        <w:t>Felix:</w:t>
       </w:r>
       <w:r>
         <w:rPr>
@@ -9283,7 +9283,7 @@
           <w:color w:val="1F5A8C"/>
           <w:sz w:val="21"/>
         </w:rPr>
-        <w:t>Clara:</w:t>
+        <w:t>Felix:</w:t>
       </w:r>
       <w:r>
         <w:rPr>
@@ -9392,7 +9392,7 @@
           <w:color w:val="1F5A8C"/>
           <w:sz w:val="21"/>
         </w:rPr>
-        <w:t>Clara:</w:t>
+        <w:t>Felix:</w:t>
       </w:r>
       <w:r>
         <w:rPr>
@@ -9444,7 +9444,7 @@
           <w:color w:val="1F5A8C"/>
           <w:sz w:val="21"/>
         </w:rPr>
-        <w:t>Clara:</w:t>
+        <w:t>Felix:</w:t>
       </w:r>
       <w:r>
         <w:rPr>
@@ -9496,7 +9496,7 @@
           <w:color w:val="1F5A8C"/>
           <w:sz w:val="21"/>
         </w:rPr>
-        <w:t>Clara:</w:t>
+        <w:t>Felix:</w:t>
       </w:r>
       <w:r>
         <w:rPr>
@@ -9504,7 +9504,7 @@
           <w:sz w:val="21"/>
         </w:rPr>
         <w:tab/>
-        <w:t>아니. 반년 동안 고민했어. 그리고 오빠가 함께 남아야만 하겠다고 했어.</w:t>
+        <w:t>아니. 반년 동안 고민했어. 그리고 형이 함께 남아야만 하겠다고 했어.</w:t>
       </w:r>
     </w:p>
     <w:p>
@@ -9574,7 +9574,7 @@
           <w:color w:val="1F5A8C"/>
           <w:sz w:val="21"/>
         </w:rPr>
-        <w:t>Clara:</w:t>
+        <w:t>Felix:</w:t>
       </w:r>
       <w:r>
         <w:rPr>
@@ -9652,7 +9652,7 @@
           <w:color w:val="1F5A8C"/>
           <w:sz w:val="21"/>
         </w:rPr>
-        <w:t>Clara:</w:t>
+        <w:t>Felix:</w:t>
       </w:r>
       <w:r>
         <w:rPr>
@@ -9704,7 +9704,7 @@
           <w:color w:val="1F5A8C"/>
           <w:sz w:val="21"/>
         </w:rPr>
-        <w:t>Clara:</w:t>
+        <w:t>Felix:</w:t>
       </w:r>
       <w:r>
         <w:rPr>
@@ -9756,7 +9756,7 @@
           <w:color w:val="1F5A8C"/>
           <w:sz w:val="21"/>
         </w:rPr>
-        <w:t>Clara:</w:t>
+        <w:t>Felix:</w:t>
       </w:r>
       <w:r>
         <w:rPr>
@@ -9808,7 +9808,7 @@
           <w:color w:val="1F5A8C"/>
           <w:sz w:val="21"/>
         </w:rPr>
-        <w:t>Clara:</w:t>
+        <w:t>Felix:</w:t>
       </w:r>
       <w:r>
         <w:rPr>
@@ -9860,7 +9860,7 @@
           <w:color w:val="1F5A8C"/>
           <w:sz w:val="21"/>
         </w:rPr>
-        <w:t>Clara:</w:t>
+        <w:t>Felix:</w:t>
       </w:r>
       <w:r>
         <w:rPr>
@@ -9938,7 +9938,7 @@
           <w:color w:val="1F5A8C"/>
           <w:sz w:val="21"/>
         </w:rPr>
-        <w:t>Clara:</w:t>
+        <w:t>Felix:</w:t>
       </w:r>
       <w:r>
         <w:rPr>
@@ -9946,7 +9946,7 @@
           <w:sz w:val="21"/>
         </w:rPr>
         <w:tab/>
-        <w:t>(미소 지으며) 예를 들면 오빠. 그래서 오빠를 프로젝트 팀에 넣고 싶은 거야.</w:t>
+        <w:t>(미소 지으며) 예를 들면 형. 그래서 형을 프로젝트 팀에 넣고 싶은 거야.</w:t>
       </w:r>
     </w:p>
     <w:p>
@@ -10203,7 +10203,7 @@
           <w:color w:val="1F5A8C"/>
           <w:sz w:val="21"/>
         </w:rPr>
-        <w:t>Clara:</w:t>
+        <w:t>Felix:</w:t>
       </w:r>
       <w:r>
         <w:rPr>
@@ -10270,7 +10270,7 @@
           <w:color w:val="1F5A8C"/>
           <w:sz w:val="21"/>
         </w:rPr>
-        <w:t>Clara:</w:t>
+        <w:t>Felix:</w:t>
       </w:r>
       <w:r>
         <w:rPr>
@@ -10322,7 +10322,7 @@
           <w:color w:val="1F5A8C"/>
           <w:sz w:val="21"/>
         </w:rPr>
-        <w:t>Clara:</w:t>
+        <w:t>Felix:</w:t>
       </w:r>
       <w:r>
         <w:rPr>
@@ -10374,7 +10374,7 @@
           <w:color w:val="1F5A8C"/>
           <w:sz w:val="21"/>
         </w:rPr>
-        <w:t>Clara:</w:t>
+        <w:t>Felix:</w:t>
       </w:r>
       <w:r>
         <w:rPr>
@@ -10452,7 +10452,7 @@
           <w:color w:val="1F5A8C"/>
           <w:sz w:val="21"/>
         </w:rPr>
-        <w:t>Clara:</w:t>
+        <w:t>Felix:</w:t>
       </w:r>
       <w:r>
         <w:rPr>
@@ -10530,7 +10530,7 @@
           <w:color w:val="1F5A8C"/>
           <w:sz w:val="21"/>
         </w:rPr>
-        <w:t>Clara:</w:t>
+        <w:t>Felix:</w:t>
       </w:r>
       <w:r>
         <w:rPr>
@@ -10582,7 +10582,7 @@
           <w:color w:val="1F5A8C"/>
           <w:sz w:val="21"/>
         </w:rPr>
-        <w:t>Clara:</w:t>
+        <w:t>Felix:</w:t>
       </w:r>
       <w:r>
         <w:rPr>
@@ -10634,7 +10634,7 @@
           <w:color w:val="1F5A8C"/>
           <w:sz w:val="21"/>
         </w:rPr>
-        <w:t>Clara:</w:t>
+        <w:t>Felix:</w:t>
       </w:r>
       <w:r>
         <w:rPr>
@@ -10743,7 +10743,7 @@
           <w:color w:val="1F5A8C"/>
           <w:sz w:val="21"/>
         </w:rPr>
-        <w:t>Clara:</w:t>
+        <w:t>Felix:</w:t>
       </w:r>
       <w:r>
         <w:rPr>
@@ -10795,7 +10795,7 @@
           <w:color w:val="1F5A8C"/>
           <w:sz w:val="21"/>
         </w:rPr>
-        <w:t>Clara:</w:t>
+        <w:t>Felix:</w:t>
       </w:r>
       <w:r>
         <w:rPr>
@@ -10847,7 +10847,7 @@
           <w:color w:val="1F5A8C"/>
           <w:sz w:val="21"/>
         </w:rPr>
-        <w:t>Clara:</w:t>
+        <w:t>Felix:</w:t>
       </w:r>
       <w:r>
         <w:rPr>
@@ -10855,7 +10855,7 @@
           <w:sz w:val="21"/>
         </w:rPr>
         <w:tab/>
-        <w:t>왜 오빠한테 묻지 않으셨어요? 오빠가 저보다 사업을 더 잘 알잖아요.</w:t>
+        <w:t>왜 형한테 묻지 않으셨어요? 형이 저보다 사업을 더 잘 알잖아요.</w:t>
       </w:r>
     </w:p>
     <w:p>
@@ -10899,7 +10899,7 @@
           <w:color w:val="1F5A8C"/>
           <w:sz w:val="21"/>
         </w:rPr>
-        <w:t>Clara:</w:t>
+        <w:t>Felix:</w:t>
       </w:r>
       <w:r>
         <w:rPr>
@@ -10951,7 +10951,7 @@
           <w:color w:val="1F5A8C"/>
           <w:sz w:val="21"/>
         </w:rPr>
-        <w:t>Clara:</w:t>
+        <w:t>Felix:</w:t>
       </w:r>
       <w:r>
         <w:rPr>
@@ -11003,7 +11003,7 @@
           <w:color w:val="1F5A8C"/>
           <w:sz w:val="21"/>
         </w:rPr>
-        <w:t>Clara:</w:t>
+        <w:t>Felix:</w:t>
       </w:r>
       <w:r>
         <w:rPr>
@@ -11055,7 +11055,7 @@
           <w:color w:val="1F5A8C"/>
           <w:sz w:val="21"/>
         </w:rPr>
-        <w:t>Clara:</w:t>
+        <w:t>Felix:</w:t>
       </w:r>
       <w:r>
         <w:rPr>
@@ -11107,7 +11107,7 @@
           <w:color w:val="1F5A8C"/>
           <w:sz w:val="21"/>
         </w:rPr>
-        <w:t>Clara:</w:t>
+        <w:t>Felix:</w:t>
       </w:r>
       <w:r>
         <w:rPr>
@@ -11159,7 +11159,7 @@
           <w:color w:val="1F5A8C"/>
           <w:sz w:val="21"/>
         </w:rPr>
-        <w:t>Clara:</w:t>
+        <w:t>Felix:</w:t>
       </w:r>
       <w:r>
         <w:rPr>
@@ -11226,7 +11226,7 @@
           <w:color w:val="1F5A8C"/>
           <w:sz w:val="21"/>
         </w:rPr>
-        <w:t>Clara:</w:t>
+        <w:t>Felix:</w:t>
       </w:r>
       <w:r>
         <w:rPr>
@@ -11278,7 +11278,7 @@
           <w:color w:val="1F5A8C"/>
           <w:sz w:val="21"/>
         </w:rPr>
-        <w:t>Clara:</w:t>
+        <w:t>Felix:</w:t>
       </w:r>
       <w:r>
         <w:rPr>
@@ -11423,7 +11423,7 @@
           <w:color w:val="1F5A8C"/>
           <w:sz w:val="21"/>
         </w:rPr>
-        <w:t>Clara:</w:t>
+        <w:t>Felix:</w:t>
       </w:r>
       <w:r>
         <w:rPr>
@@ -11475,7 +11475,7 @@
           <w:color w:val="1F5A8C"/>
           <w:sz w:val="21"/>
         </w:rPr>
-        <w:t>Clara:</w:t>
+        <w:t>Felix:</w:t>
       </w:r>
       <w:r>
         <w:rPr>
@@ -11550,7 +11550,7 @@
           <w:color w:val="1F3A5F"/>
           <w:sz w:val="20"/>
         </w:rPr>
-        <w:t>다음 화 예고 Ausblick — 제2화 « Der erste Jour fixe » — 월요일 오전 9시, 클라라의 첫 정기회의. 마티아스는 반론 목록을 들고 오고, 브란트는 '100일 점검'에 드는 예산부터 묻는다. 그리고 서울의 최 바이어에게서 답장이 온다.</w:t>
+        <w:t>다음 화 예고 Ausblick — 제2화 « Der erste Jour fixe » — 월요일 오전 9시, 펠릭스의 첫 정기회의. 마티아스는 반론 목록을 들고 오고, 브란트는 '100일 점검'에 드는 예산부터 묻는다. 그리고 서울의 최 바이어에게서 답장이 온다.</w:t>
       </w:r>
     </w:p>
     <w:sectPr>

</xml_diff>